<commit_message>
Add citation of OSF repository
</commit_message>
<xml_diff>
--- a/output/papers/Round 3/manuscript-brief-clean.docx
+++ b/output/papers/Round 3/manuscript-brief-clean.docx
@@ -25254,6 +25254,49 @@
         <w:rPr>
           <w:szCs w:val="22"/>
         </w:rPr>
+        <w:t xml:space="preserve">Cummings, S., </w:t>
+      </w:r>
+      <w:proofErr w:type="spellStart"/>
+      <w:r>
+        <w:rPr>
+          <w:szCs w:val="22"/>
+        </w:rPr>
+        <w:t>Karboga</w:t>
+      </w:r>
+      <w:proofErr w:type="spellEnd"/>
+      <w:r>
+        <w:rPr>
+          <w:szCs w:val="22"/>
+        </w:rPr>
+        <w:t xml:space="preserve">, G. E., Yang, M., &amp; Jaeger, T. F. (2025, January 21). Cummings, </w:t>
+      </w:r>
+      <w:proofErr w:type="spellStart"/>
+      <w:r>
+        <w:rPr>
+          <w:szCs w:val="22"/>
+        </w:rPr>
+        <w:t>Karboga</w:t>
+      </w:r>
+      <w:proofErr w:type="spellEnd"/>
+      <w:r>
+        <w:rPr>
+          <w:szCs w:val="22"/>
+        </w:rPr>
+        <w:t>, Yang, &amp; Jaeger. Compensation in audiovisual speech perception: discounting the pen in the mouth. Retrieved from osf.io/2asgw</w:t>
+      </w:r>
+    </w:p>
+    <w:p>
+      <w:pPr>
+        <w:spacing w:line="240" w:lineRule="auto"/>
+        <w:ind w:left="360" w:hanging="360"/>
+        <w:rPr>
+          <w:szCs w:val="22"/>
+        </w:rPr>
+      </w:pPr>
+      <w:r>
+        <w:rPr>
+          <w:szCs w:val="22"/>
+        </w:rPr>
         <w:t>Cummings, S. N., &amp; Theodore, R. M. (2023). Hearing is believing: Lexically guided perceptual learning is graded to reflect the quantity of evidence in speech input. </w:t>
       </w:r>
       <w:r>
@@ -25807,7 +25850,14 @@
         <w:rPr>
           <w:szCs w:val="22"/>
         </w:rPr>
-        <w:t xml:space="preserve">S., Johnson, K., &amp; Finley, G. (2016). Effects of native language on compensation for Coarticulation. </w:t>
+        <w:t xml:space="preserve">S., Johnson, K., &amp; Finley, G. (2016). Effects of native language on compensation for </w:t>
+      </w:r>
+      <w:r>
+        <w:rPr>
+          <w:szCs w:val="22"/>
+        </w:rPr>
+        <w:lastRenderedPageBreak/>
+        <w:t xml:space="preserve">Coarticulation. </w:t>
       </w:r>
       <w:r>
         <w:rPr>
@@ -25879,7 +25929,6 @@
         <w:rPr>
           <w:szCs w:val="22"/>
         </w:rPr>
-        <w:lastRenderedPageBreak/>
         <w:t xml:space="preserve">Kraljic, T., &amp; Samuel, A. G. (2011). Perceptual learning evidence for contextually-specific representations. </w:t>
       </w:r>
       <w:r>
@@ -26841,6 +26890,7 @@
         <w:rPr>
           <w:szCs w:val="22"/>
         </w:rPr>
+        <w:lastRenderedPageBreak/>
         <w:t xml:space="preserve">Soli, </w:t>
       </w:r>
       <w:r>
@@ -26882,14 +26932,7 @@
         <w:rPr>
           <w:szCs w:val="22"/>
         </w:rPr>
-        <w:t xml:space="preserve">A. K., &amp; Gopal, H. S. (1986). A perceptual model of vowel recognition based on the </w:t>
-      </w:r>
-      <w:r>
-        <w:rPr>
-          <w:szCs w:val="22"/>
-        </w:rPr>
-        <w:lastRenderedPageBreak/>
-        <w:t xml:space="preserve">auditory representation of American English vowels. </w:t>
+        <w:t xml:space="preserve">A. K., &amp; Gopal, H. S. (1986). A perceptual model of vowel recognition based on the auditory representation of American English vowels. </w:t>
       </w:r>
       <w:r>
         <w:rPr>
@@ -32884,7 +32927,6 @@
   <w:style w:type="character" w:default="1" w:styleId="DefaultParagraphFont">
     <w:name w:val="Default Paragraph Font"/>
     <w:uiPriority w:val="1"/>
-    <w:semiHidden/>
     <w:unhideWhenUsed/>
   </w:style>
   <w:style w:type="table" w:default="1" w:styleId="TableNormal">
@@ -33779,7 +33821,7 @@
 </file>
 
 <file path=customXml/itemProps1.xml><?xml version="1.0" encoding="utf-8"?>
-<ds:datastoreItem xmlns:ds="http://schemas.openxmlformats.org/officeDocument/2006/customXml" ds:itemID="{CEAF82DD-8E2B-F442-854C-D22AA8B4402F}">
+<ds:datastoreItem xmlns:ds="http://schemas.openxmlformats.org/officeDocument/2006/customXml" ds:itemID="{B20ED14E-20BD-0342-A447-925FFA2C3804}">
   <ds:schemaRefs>
     <ds:schemaRef ds:uri="http://schemas.openxmlformats.org/officeDocument/2006/bibliography"/>
   </ds:schemaRefs>
@@ -33787,7 +33829,7 @@
 </file>
 
 <file path=customXml/itemProps2.xml><?xml version="1.0" encoding="utf-8"?>
-<ds:datastoreItem xmlns:ds="http://schemas.openxmlformats.org/officeDocument/2006/customXml" ds:itemID="{B20ED14E-20BD-0342-A447-925FFA2C3804}">
+<ds:datastoreItem xmlns:ds="http://schemas.openxmlformats.org/officeDocument/2006/customXml" ds:itemID="{CEAF82DD-8E2B-F442-854C-D22AA8B4402F}">
   <ds:schemaRefs>
     <ds:schemaRef ds:uri="http://schemas.openxmlformats.org/officeDocument/2006/bibliography"/>
   </ds:schemaRefs>

</xml_diff>